<commit_message>
Adding release notes to be used by the generated package
</commit_message>
<xml_diff>
--- a/typhoon_package/release_notes/release_notes.docx
+++ b/typhoon_package/release_notes/release_notes.docx
@@ -24,16 +24,7 @@
         <w:t xml:space="preserve"> </w:t>
       </w:r>
       <w:r>
-        <w:t>0.</w:t>
-      </w:r>
-      <w:r>
-        <w:t>5</w:t>
-      </w:r>
-      <w:r>
-        <w:t>.</w:t>
-      </w:r>
-      <w:r>
-        <w:t>1</w:t>
+        <w:t>Integration</w:t>
       </w:r>
     </w:p>
     <w:p>
@@ -58,30 +49,33 @@
     </w:p>
     <w:p>
       <w:pPr>
-        <w:jc w:val="both"/>
+        <w:pStyle w:val="Heading1"/>
         <w:rPr>
           <w:lang w:val="en-GB"/>
         </w:rPr>
       </w:pPr>
+      <w:r>
+        <w:t>v0.5.</w:t>
+      </w:r>
+      <w:r>
+        <w:t>2</w:t>
+      </w:r>
     </w:p>
     <w:p>
       <w:pPr>
         <w:jc w:val="both"/>
       </w:pPr>
       <w:r>
-        <w:t xml:space="preserve">Compatible with Typhoon HIL Control Center </w:t>
-      </w:r>
-      <w:r>
-        <w:t>202</w:t>
-      </w:r>
-      <w:r>
-        <w:t>5</w:t>
+        <w:t>Compatible with Typhoon HIL Control Center 202</w:t>
+      </w:r>
+      <w:r>
+        <w:t>6</w:t>
       </w:r>
       <w:r>
         <w:t>.</w:t>
       </w:r>
       <w:r>
-        <w:t>2</w:t>
+        <w:t>3</w:t>
       </w:r>
     </w:p>
     <w:p>
@@ -94,13 +88,7 @@
         <w:jc w:val="both"/>
       </w:pPr>
       <w:r>
-        <w:t>Improvements</w:t>
-      </w:r>
-      <w:r>
-        <w:t>/bugfixes</w:t>
-      </w:r>
-      <w:r>
-        <w:t>:</w:t>
+        <w:t>Improvements/bugfixes:</w:t>
       </w:r>
     </w:p>
     <w:p>
@@ -113,34 +101,19 @@
         <w:jc w:val="both"/>
       </w:pPr>
       <w:r>
-        <w:t>Generator</w:t>
-      </w:r>
-      <w:r>
-        <w:t xml:space="preserve"> stability improvements</w:t>
-      </w:r>
-      <w:r>
-        <w:t xml:space="preserve"> </w:t>
-      </w:r>
-      <w:r>
-        <w:t xml:space="preserve">and </w:t>
-      </w:r>
-      <w:r>
-        <w:t>f</w:t>
-      </w:r>
-      <w:r>
-        <w:t xml:space="preserve">ixes </w:t>
-      </w:r>
-      <w:r>
-        <w:t xml:space="preserve">to </w:t>
-      </w:r>
-      <w:r>
-        <w:t>the incorrect power and voltage units in the mask description</w:t>
-      </w:r>
-      <w:r>
-        <w:t xml:space="preserve"> of the Generator </w:t>
-      </w:r>
-      <w:r>
-        <w:t>Controller.</w:t>
+        <w:t xml:space="preserve">Generator pre-compiler fixed to properly refer to </w:t>
+      </w:r>
+      <w:proofErr w:type="spellStart"/>
+      <w:r>
+        <w:rPr>
+          <w:i/>
+          <w:iCs/>
+        </w:rPr>
+        <w:t>basefreq</w:t>
+      </w:r>
+      <w:proofErr w:type="spellEnd"/>
+      <w:r>
+        <w:t xml:space="preserve"> variable</w:t>
       </w:r>
     </w:p>
     <w:p>
@@ -153,19 +126,7 @@
         <w:jc w:val="both"/>
       </w:pPr>
       <w:r>
-        <w:t>Load</w:t>
-      </w:r>
-      <w:r>
-        <w:t xml:space="preserve"> mask</w:t>
-      </w:r>
-      <w:r>
-        <w:t xml:space="preserve"> </w:t>
-      </w:r>
-      <w:r>
-        <w:t>bugfixes</w:t>
-      </w:r>
-      <w:r>
-        <w:t xml:space="preserve"> in transition between load types.</w:t>
+        <w:t>Generator field voltage and mechanical torque inputs now use a delay to eliminate algebraic loops</w:t>
       </w:r>
     </w:p>
     <w:p>
@@ -178,18 +139,7 @@
         <w:jc w:val="both"/>
       </w:pPr>
       <w:r>
-        <w:t xml:space="preserve">Fixed </w:t>
-      </w:r>
-      <w:proofErr w:type="spellStart"/>
-      <w:r>
-        <w:t>Vsource</w:t>
-      </w:r>
-      <w:proofErr w:type="spellEnd"/>
-      <w:r>
-        <w:t xml:space="preserve"> container</w:t>
-      </w:r>
-      <w:r>
-        <w:t>.</w:t>
+        <w:t>Load component’s mask updated to fix zero sequence removal in CPL mode.</w:t>
       </w:r>
     </w:p>
     <w:p>
@@ -202,6 +152,452 @@
         <w:jc w:val="both"/>
       </w:pPr>
       <w:r>
+        <w:t xml:space="preserve">Load component’s internal Kalman filter updated to solve reference </w:t>
+      </w:r>
+      <w:r>
+        <w:t>to non-existent</w:t>
+      </w:r>
+      <w:r>
+        <w:t xml:space="preserve"> variable problem</w:t>
+      </w:r>
+    </w:p>
+    <w:p>
+      <w:pPr>
+        <w:pStyle w:val="ListParagraph"/>
+        <w:numPr>
+          <w:ilvl w:val="1"/>
+          <w:numId w:val="45"/>
+        </w:numPr>
+        <w:jc w:val="both"/>
+      </w:pPr>
+      <w:r>
+        <w:t>Fix for incorrect handling of the neutral connector automatic number setting:</w:t>
+      </w:r>
+    </w:p>
+    <w:p>
+      <w:pPr>
+        <w:pStyle w:val="ListParagraph"/>
+        <w:numPr>
+          <w:ilvl w:val="2"/>
+          <w:numId w:val="45"/>
+        </w:numPr>
+        <w:jc w:val="both"/>
+      </w:pPr>
+      <w:r>
+        <w:t>For components with more than three phases, in which none of the terminals is labeled N. E.g., four-phase transmission line when terminal D is connected to a Bus Neutral.</w:t>
+      </w:r>
+    </w:p>
+    <w:p>
+      <w:pPr>
+        <w:pStyle w:val="ListParagraph"/>
+        <w:numPr>
+          <w:ilvl w:val="2"/>
+          <w:numId w:val="45"/>
+        </w:numPr>
+        <w:jc w:val="both"/>
+      </w:pPr>
+      <w:r>
+        <w:t xml:space="preserve">For single phase components that are connected between a phase and neutral. E.g., single-phase load connected between a </w:t>
+      </w:r>
+      <w:proofErr w:type="spellStart"/>
+      <w:r>
+        <w:t>Bus’</w:t>
+      </w:r>
+      <w:proofErr w:type="spellEnd"/>
+      <w:r>
+        <w:t xml:space="preserve"> A and N terminals.</w:t>
+      </w:r>
+    </w:p>
+    <w:p>
+      <w:pPr>
+        <w:pStyle w:val="ListParagraph"/>
+        <w:numPr>
+          <w:ilvl w:val="1"/>
+          <w:numId w:val="45"/>
+        </w:numPr>
+        <w:jc w:val="both"/>
+      </w:pPr>
+      <w:r>
+        <w:t xml:space="preserve">Transformers core coupling setting </w:t>
+      </w:r>
+      <w:r>
+        <w:t>fixed to solve invalid reference to an internal property</w:t>
+      </w:r>
+    </w:p>
+    <w:p>
+      <w:pPr>
+        <w:pStyle w:val="ListParagraph"/>
+        <w:numPr>
+          <w:ilvl w:val="1"/>
+          <w:numId w:val="45"/>
+        </w:numPr>
+        <w:jc w:val="both"/>
+      </w:pPr>
+      <w:r>
+        <w:t xml:space="preserve">Transmission lines parametrized to used couplings fixed to avoid evaluation </w:t>
+      </w:r>
+      <w:proofErr w:type="gramStart"/>
+      <w:r>
+        <w:t>error</w:t>
+      </w:r>
+      <w:proofErr w:type="gramEnd"/>
+      <w:r>
+        <w:t xml:space="preserve"> originated by incorrect conversion call to float. Moved from </w:t>
+      </w:r>
+      <w:proofErr w:type="spellStart"/>
+      <w:r>
+        <w:t>Numpy’s</w:t>
+      </w:r>
+      <w:proofErr w:type="spellEnd"/>
+      <w:r>
+        <w:t xml:space="preserve"> </w:t>
+      </w:r>
+      <w:r>
+        <w:rPr>
+          <w:i/>
+          <w:iCs/>
+        </w:rPr>
+        <w:t>float64()</w:t>
+      </w:r>
+      <w:r>
+        <w:t xml:space="preserve"> to Python’s native </w:t>
+      </w:r>
+      <w:proofErr w:type="gramStart"/>
+      <w:r>
+        <w:rPr>
+          <w:i/>
+          <w:iCs/>
+        </w:rPr>
+        <w:t>float(</w:t>
+      </w:r>
+      <w:proofErr w:type="gramEnd"/>
+      <w:r>
+        <w:rPr>
+          <w:i/>
+          <w:iCs/>
+        </w:rPr>
+        <w:t>)</w:t>
+      </w:r>
+    </w:p>
+    <w:p>
+      <w:pPr>
+        <w:pStyle w:val="ListParagraph"/>
+        <w:numPr>
+          <w:ilvl w:val="0"/>
+          <w:numId w:val="45"/>
+        </w:numPr>
+        <w:jc w:val="both"/>
+      </w:pPr>
+      <w:r>
+        <w:t>Added examples:</w:t>
+      </w:r>
+    </w:p>
+    <w:p>
+      <w:pPr>
+        <w:pStyle w:val="ListParagraph"/>
+        <w:numPr>
+          <w:ilvl w:val="1"/>
+          <w:numId w:val="45"/>
+        </w:numPr>
+        <w:jc w:val="both"/>
+      </w:pPr>
+      <w:r>
+        <w:t>Included set of unit test examples:</w:t>
+      </w:r>
+    </w:p>
+    <w:p>
+      <w:pPr>
+        <w:pStyle w:val="ListParagraph"/>
+        <w:numPr>
+          <w:ilvl w:val="2"/>
+          <w:numId w:val="45"/>
+        </w:numPr>
+        <w:jc w:val="both"/>
+      </w:pPr>
+      <w:r>
+        <w:t>Generator component</w:t>
+      </w:r>
+    </w:p>
+    <w:p>
+      <w:pPr>
+        <w:pStyle w:val="ListParagraph"/>
+        <w:numPr>
+          <w:ilvl w:val="3"/>
+          <w:numId w:val="45"/>
+        </w:numPr>
+        <w:jc w:val="both"/>
+      </w:pPr>
+      <w:r>
+        <w:t>With dynamic controls</w:t>
+      </w:r>
+    </w:p>
+    <w:p>
+      <w:pPr>
+        <w:pStyle w:val="ListParagraph"/>
+        <w:numPr>
+          <w:ilvl w:val="3"/>
+          <w:numId w:val="45"/>
+        </w:numPr>
+        <w:jc w:val="both"/>
+      </w:pPr>
+      <w:r>
+        <w:t>With static controls</w:t>
+      </w:r>
+    </w:p>
+    <w:p>
+      <w:pPr>
+        <w:pStyle w:val="ListParagraph"/>
+        <w:numPr>
+          <w:ilvl w:val="3"/>
+          <w:numId w:val="45"/>
+        </w:numPr>
+        <w:jc w:val="both"/>
+      </w:pPr>
+      <w:r>
+        <w:t>Interoperating with a converter</w:t>
+      </w:r>
+    </w:p>
+    <w:p>
+      <w:pPr>
+        <w:pStyle w:val="ListParagraph"/>
+        <w:numPr>
+          <w:ilvl w:val="2"/>
+          <w:numId w:val="45"/>
+        </w:numPr>
+        <w:jc w:val="both"/>
+      </w:pPr>
+      <w:r>
+        <w:t>PV System</w:t>
+      </w:r>
+    </w:p>
+    <w:p>
+      <w:pPr>
+        <w:pStyle w:val="ListParagraph"/>
+        <w:numPr>
+          <w:ilvl w:val="2"/>
+          <w:numId w:val="45"/>
+        </w:numPr>
+        <w:jc w:val="both"/>
+      </w:pPr>
+      <w:r>
+        <w:t xml:space="preserve">Three-winding </w:t>
+      </w:r>
+      <w:proofErr w:type="gramStart"/>
+      <w:r>
+        <w:t>transformer</w:t>
+      </w:r>
+      <w:proofErr w:type="gramEnd"/>
+    </w:p>
+    <w:p>
+      <w:pPr>
+        <w:pStyle w:val="ListParagraph"/>
+        <w:numPr>
+          <w:ilvl w:val="2"/>
+          <w:numId w:val="45"/>
+        </w:numPr>
+        <w:jc w:val="both"/>
+      </w:pPr>
+      <w:r>
+        <w:t>VS Converter</w:t>
+      </w:r>
+    </w:p>
+    <w:p>
+      <w:pPr>
+        <w:pStyle w:val="ListParagraph"/>
+        <w:numPr>
+          <w:ilvl w:val="3"/>
+          <w:numId w:val="45"/>
+        </w:numPr>
+        <w:jc w:val="both"/>
+      </w:pPr>
+      <w:r>
+        <w:t>External controls - consuming power</w:t>
+      </w:r>
+    </w:p>
+    <w:p>
+      <w:pPr>
+        <w:pStyle w:val="ListParagraph"/>
+        <w:numPr>
+          <w:ilvl w:val="3"/>
+          <w:numId w:val="45"/>
+        </w:numPr>
+        <w:jc w:val="both"/>
+      </w:pPr>
+      <w:r>
+        <w:t>External controls - generating power</w:t>
+      </w:r>
+    </w:p>
+    <w:p>
+      <w:pPr>
+        <w:pStyle w:val="ListParagraph"/>
+        <w:numPr>
+          <w:ilvl w:val="3"/>
+          <w:numId w:val="45"/>
+        </w:numPr>
+        <w:jc w:val="both"/>
+      </w:pPr>
+      <w:r>
+        <w:t>Internal controls</w:t>
+      </w:r>
+    </w:p>
+    <w:p>
+      <w:r>
+        <w:br w:type="page"/>
+      </w:r>
+    </w:p>
+    <w:p>
+      <w:pPr>
+        <w:pStyle w:val="Heading1"/>
+        <w:rPr>
+          <w:lang w:val="en-GB"/>
+        </w:rPr>
+      </w:pPr>
+      <w:r>
+        <w:lastRenderedPageBreak/>
+        <w:t>v</w:t>
+      </w:r>
+      <w:r>
+        <w:t>0.5.1</w:t>
+      </w:r>
+    </w:p>
+    <w:p>
+      <w:pPr>
+        <w:jc w:val="both"/>
+      </w:pPr>
+      <w:r>
+        <w:t xml:space="preserve">Compatible with Typhoon HIL Control Center </w:t>
+      </w:r>
+      <w:r>
+        <w:t>202</w:t>
+      </w:r>
+      <w:r>
+        <w:t>5</w:t>
+      </w:r>
+      <w:r>
+        <w:t>.</w:t>
+      </w:r>
+      <w:r>
+        <w:t>2</w:t>
+      </w:r>
+    </w:p>
+    <w:p>
+      <w:pPr>
+        <w:pStyle w:val="ListParagraph"/>
+        <w:numPr>
+          <w:ilvl w:val="0"/>
+          <w:numId w:val="45"/>
+        </w:numPr>
+        <w:jc w:val="both"/>
+      </w:pPr>
+      <w:r>
+        <w:t>Improvements</w:t>
+      </w:r>
+      <w:r>
+        <w:t>/bugfixes</w:t>
+      </w:r>
+      <w:r>
+        <w:t>:</w:t>
+      </w:r>
+    </w:p>
+    <w:p>
+      <w:pPr>
+        <w:pStyle w:val="ListParagraph"/>
+        <w:numPr>
+          <w:ilvl w:val="1"/>
+          <w:numId w:val="45"/>
+        </w:numPr>
+        <w:jc w:val="both"/>
+      </w:pPr>
+      <w:r>
+        <w:t>Generator</w:t>
+      </w:r>
+      <w:r>
+        <w:t xml:space="preserve"> stability improvements</w:t>
+      </w:r>
+      <w:r>
+        <w:t xml:space="preserve"> </w:t>
+      </w:r>
+      <w:r>
+        <w:t xml:space="preserve">and </w:t>
+      </w:r>
+      <w:r>
+        <w:t>f</w:t>
+      </w:r>
+      <w:r>
+        <w:t xml:space="preserve">ixes </w:t>
+      </w:r>
+      <w:r>
+        <w:t xml:space="preserve">to </w:t>
+      </w:r>
+      <w:r>
+        <w:t>the incorrect power and voltage units in the mask description</w:t>
+      </w:r>
+      <w:r>
+        <w:t xml:space="preserve"> of the Generator </w:t>
+      </w:r>
+      <w:r>
+        <w:t>Controller.</w:t>
+      </w:r>
+    </w:p>
+    <w:p>
+      <w:pPr>
+        <w:pStyle w:val="ListParagraph"/>
+        <w:numPr>
+          <w:ilvl w:val="1"/>
+          <w:numId w:val="45"/>
+        </w:numPr>
+        <w:jc w:val="both"/>
+      </w:pPr>
+      <w:r>
+        <w:t>Load</w:t>
+      </w:r>
+      <w:r>
+        <w:t xml:space="preserve"> mask</w:t>
+      </w:r>
+      <w:r>
+        <w:t xml:space="preserve"> </w:t>
+      </w:r>
+      <w:r>
+        <w:t>bugfixes</w:t>
+      </w:r>
+      <w:r>
+        <w:t xml:space="preserve"> in transition between load types.</w:t>
+      </w:r>
+    </w:p>
+    <w:p>
+      <w:pPr>
+        <w:pStyle w:val="ListParagraph"/>
+        <w:numPr>
+          <w:ilvl w:val="1"/>
+          <w:numId w:val="45"/>
+        </w:numPr>
+        <w:jc w:val="both"/>
+      </w:pPr>
+      <w:r>
+        <w:t xml:space="preserve">Fixed </w:t>
+      </w:r>
+      <w:proofErr w:type="spellStart"/>
+      <w:r>
+        <w:t>Vsource</w:t>
+      </w:r>
+      <w:proofErr w:type="spellEnd"/>
+      <w:r>
+        <w:t xml:space="preserve"> container</w:t>
+      </w:r>
+      <w:r>
+        <w:t>.</w:t>
+      </w:r>
+    </w:p>
+    <w:p>
+      <w:pPr>
+        <w:pStyle w:val="ListParagraph"/>
+        <w:numPr>
+          <w:ilvl w:val="1"/>
+          <w:numId w:val="45"/>
+        </w:numPr>
+        <w:jc w:val="both"/>
+      </w:pPr>
+      <w:r>
         <w:t>Updated handling of time series inputs on</w:t>
       </w:r>
       <w:r>
@@ -210,13 +606,8 @@
       <w:r>
         <w:t xml:space="preserve"> </w:t>
       </w:r>
-      <w:proofErr w:type="spellStart"/>
-      <w:r>
-        <w:t>SimDSS</w:t>
-      </w:r>
-      <w:proofErr w:type="spellEnd"/>
-      <w:r>
-        <w:t xml:space="preserve"> component.</w:t>
+      <w:r>
+        <w:t>SimDSS component.</w:t>
       </w:r>
     </w:p>
     <w:p>
@@ -455,7 +846,6 @@
       <w:tc>
         <w:tcPr>
           <w:tcW w:w="1667" w:type="pct"/>
-          <w:shd w:val="clear" w:color="auto" w:fill="auto"/>
         </w:tcPr>
         <w:p>
           <w:pPr>
@@ -2287,7 +2677,7 @@
         <w:rFonts w:ascii="Courier New" w:hAnsi="Courier New" w:cs="Courier New" w:hint="default"/>
       </w:rPr>
     </w:lvl>
-    <w:lvl w:ilvl="2" w:tplc="04160005" w:tentative="1">
+    <w:lvl w:ilvl="2" w:tplc="04160005">
       <w:start w:val="1"/>
       <w:numFmt w:val="bullet"/>
       <w:lvlText w:val=""/>
@@ -2299,7 +2689,7 @@
         <w:rFonts w:ascii="Wingdings" w:hAnsi="Wingdings" w:hint="default"/>
       </w:rPr>
     </w:lvl>
-    <w:lvl w:ilvl="3" w:tplc="04160001" w:tentative="1">
+    <w:lvl w:ilvl="3" w:tplc="04160001">
       <w:start w:val="1"/>
       <w:numFmt w:val="bullet"/>
       <w:lvlText w:val=""/>
@@ -7352,9 +7742,12 @@
 </file>
 
 <file path=customXml/item1.xml><?xml version="1.0" encoding="utf-8"?>
-<p:properties xmlns:p="http://schemas.microsoft.com/office/2006/metadata/properties" xmlns:xsi="http://www.w3.org/2001/XMLSchema-instance" xmlns:pc="http://schemas.microsoft.com/office/infopath/2007/PartnerControls">
-  <documentManagement/>
-</p:properties>
+<?mso-contentType ?>
+<FormTemplates xmlns="http://schemas.microsoft.com/sharepoint/v3/contenttype/forms">
+  <Display>DocumentLibraryForm</Display>
+  <Edit>DocumentLibraryForm</Edit>
+  <New>DocumentLibraryForm</New>
+</FormTemplates>
 </file>
 
 <file path=customXml/item2.xml><?xml version="1.0" encoding="utf-8"?>
@@ -7362,12 +7755,9 @@
 </file>
 
 <file path=customXml/item3.xml><?xml version="1.0" encoding="utf-8"?>
-<?mso-contentType ?>
-<FormTemplates xmlns="http://schemas.microsoft.com/sharepoint/v3/contenttype/forms">
-  <Display>DocumentLibraryForm</Display>
-  <Edit>DocumentLibraryForm</Edit>
-  <New>DocumentLibraryForm</New>
-</FormTemplates>
+<p:properties xmlns:p="http://schemas.microsoft.com/office/2006/metadata/properties" xmlns:xsi="http://www.w3.org/2001/XMLSchema-instance" xmlns:pc="http://schemas.microsoft.com/office/infopath/2007/PartnerControls">
+  <documentManagement/>
+</p:properties>
 </file>
 
 <file path=customXml/item4.xml><?xml version="1.0" encoding="utf-8"?>
@@ -7588,10 +7978,9 @@
 </file>
 
 <file path=customXml/itemProps1.xml><?xml version="1.0" encoding="utf-8"?>
-<ds:datastoreItem xmlns:ds="http://schemas.openxmlformats.org/officeDocument/2006/customXml" ds:itemID="{93EE7F1D-014D-4AFB-A288-C1A14B647702}">
+<ds:datastoreItem xmlns:ds="http://schemas.openxmlformats.org/officeDocument/2006/customXml" ds:itemID="{01DA87C2-6376-4FBC-A762-55560EE126B5}">
   <ds:schemaRefs>
-    <ds:schemaRef ds:uri="http://schemas.microsoft.com/office/2006/metadata/properties"/>
-    <ds:schemaRef ds:uri="http://schemas.microsoft.com/office/infopath/2007/PartnerControls"/>
+    <ds:schemaRef ds:uri="http://schemas.microsoft.com/sharepoint/v3/contenttype/forms"/>
   </ds:schemaRefs>
 </ds:datastoreItem>
 </file>
@@ -7605,9 +7994,10 @@
 </file>
 
 <file path=customXml/itemProps3.xml><?xml version="1.0" encoding="utf-8"?>
-<ds:datastoreItem xmlns:ds="http://schemas.openxmlformats.org/officeDocument/2006/customXml" ds:itemID="{01DA87C2-6376-4FBC-A762-55560EE126B5}">
+<ds:datastoreItem xmlns:ds="http://schemas.openxmlformats.org/officeDocument/2006/customXml" ds:itemID="{93EE7F1D-014D-4AFB-A288-C1A14B647702}">
   <ds:schemaRefs>
-    <ds:schemaRef ds:uri="http://schemas.microsoft.com/sharepoint/v3/contenttype/forms"/>
+    <ds:schemaRef ds:uri="http://schemas.microsoft.com/office/2006/metadata/properties"/>
+    <ds:schemaRef ds:uri="http://schemas.microsoft.com/office/infopath/2007/PartnerControls"/>
   </ds:schemaRefs>
 </ds:datastoreItem>
 </file>

</xml_diff>